<commit_message>
fix: preserve original v0.1 documents and restore runtime status after legacy document auto-build
</commit_message>
<xml_diff>
--- a/deliverables/RDelay_참가신청서_v0.1.docx
+++ b/deliverables/RDelay_참가신청서_v0.1.docx
@@ -2007,698 +2007,627 @@
     </w:p>
     <w:p>
       <w:pPr>
-        <w:pStyle w:val="FirstParagraph"/>
+        <w:spacing w:before="80" w:after="120"/>
+        <w:jc w:val="center"/>
       </w:pPr>
-      <m:oMathPara>
-        <m:oMathParaPr>
-          <m:jc m:val="center"/>
-        </m:oMathParaPr>
-        <m:oMath>
-          <m:f>
-            <m:fPr>
-              <m:type m:val="bar"/>
-            </m:fPr>
-            <m:num>
-              <m:r>
-                <m:t>d</m:t>
-              </m:r>
-              <m:sSub>
-                <m:e>
-                  <m:r>
-                    <m:t>I</m:t>
-                  </m:r>
-                </m:e>
-                <m:sub>
-                  <m:r>
-                    <m:t>i</m:t>
-                  </m:r>
-                </m:sub>
-              </m:sSub>
-            </m:num>
-            <m:den>
-              <m:r>
-                <m:t>d</m:t>
-              </m:r>
-              <m:r>
-                <m:t>t</m:t>
-              </m:r>
-            </m:den>
-          </m:f>
-          <m:r>
-            <m:rPr>
-              <m:sty m:val="p"/>
-            </m:rPr>
-            <m:t>=</m:t>
-          </m:r>
-          <m:sSub>
-            <m:e>
-              <m:r>
-                <m:t>β</m:t>
-              </m:r>
-            </m:e>
-            <m:sub>
-              <m:r>
-                <m:t>i</m:t>
-              </m:r>
-            </m:sub>
-          </m:sSub>
-          <m:d>
-            <m:dPr>
-              <m:begChr m:val="("/>
-              <m:endChr m:val=")"/>
-              <m:sepChr m:val=""/>
-              <m:grow/>
-            </m:dPr>
-            <m:e>
-              <m:r>
-                <m:t>t</m:t>
-              </m:r>
-            </m:e>
-          </m:d>
-          <m:d>
-            <m:dPr>
-              <m:begChr m:val="("/>
-              <m:endChr m:val=")"/>
-              <m:sepChr m:val=""/>
-              <m:grow/>
-            </m:dPr>
-            <m:e>
-              <m:r>
-                <m:t>1</m:t>
-              </m:r>
-              <m:r>
-                <m:rPr>
-                  <m:sty m:val="p"/>
-                </m:rPr>
-                <m:t>−</m:t>
-              </m:r>
-              <m:f>
-                <m:fPr>
-                  <m:type m:val="bar"/>
-                </m:fPr>
-                <m:num>
-                  <m:sSub>
-                    <m:e>
-                      <m:r>
-                        <m:t>I</m:t>
-                      </m:r>
-                    </m:e>
-                    <m:sub>
-                      <m:r>
-                        <m:t>i</m:t>
-                      </m:r>
-                    </m:sub>
-                  </m:sSub>
-                </m:num>
-                <m:den>
-                  <m:sSub>
-                    <m:e>
-                      <m:r>
-                        <m:t>N</m:t>
-                      </m:r>
-                    </m:e>
-                    <m:sub>
-                      <m:r>
-                        <m:t>i</m:t>
-                      </m:r>
-                    </m:sub>
-                  </m:sSub>
-                </m:den>
-              </m:f>
-            </m:e>
-          </m:d>
-          <m:nary>
-            <m:naryPr>
-              <m:chr m:val="∑"/>
-              <m:limLoc m:val="undOvr"/>
-              <m:subHide m:val="off"/>
-              <m:supHide m:val="on"/>
-            </m:naryPr>
-            <m:sub>
-              <m:r>
-                <m:t>j</m:t>
-              </m:r>
-            </m:sub>
-            <m:sup>
-              <m:r>
-                <m:t>​</m:t>
-              </m:r>
-            </m:sup>
-            <m:e>
-              <m:sSub>
-                <m:e>
-                  <m:r>
-                    <m:t>C</m:t>
-                  </m:r>
-                </m:e>
-                <m:sub>
-                  <m:r>
-                    <m:t>i</m:t>
-                  </m:r>
-                  <m:r>
-                    <m:t>j</m:t>
-                  </m:r>
-                </m:sub>
-              </m:sSub>
-            </m:e>
-          </m:nary>
-          <m:d>
-            <m:dPr>
-              <m:begChr m:val="("/>
-              <m:endChr m:val=")"/>
-              <m:sepChr m:val=""/>
-              <m:grow/>
-            </m:dPr>
-            <m:e>
-              <m:r>
-                <m:t>t</m:t>
-              </m:r>
-            </m:e>
-          </m:d>
-          <m:sSub>
-            <m:e>
-              <m:r>
-                <m:t>I</m:t>
-              </m:r>
-            </m:e>
-            <m:sub>
-              <m:r>
-                <m:t>j</m:t>
-              </m:r>
-            </m:sub>
-          </m:sSub>
-          <m:r>
-            <m:rPr>
-              <m:sty m:val="p"/>
-            </m:rPr>
-            <m:t>−</m:t>
-          </m:r>
-          <m:sSub>
-            <m:e>
-              <m:r>
-                <m:t>γ</m:t>
-              </m:r>
-            </m:e>
-            <m:sub>
-              <m:r>
-                <m:t>i</m:t>
-              </m:r>
-            </m:sub>
-          </m:sSub>
-          <m:d>
-            <m:dPr>
-              <m:begChr m:val="("/>
-              <m:endChr m:val=")"/>
-              <m:sepChr m:val=""/>
-              <m:grow/>
-            </m:dPr>
-            <m:e>
-              <m:r>
-                <m:t>t</m:t>
-              </m:r>
-            </m:e>
-          </m:d>
-          <m:sSub>
-            <m:e>
-              <m:r>
-                <m:t>I</m:t>
-              </m:r>
-            </m:e>
-            <m:sub>
-              <m:r>
-                <m:t>i</m:t>
-              </m:r>
-            </m:sub>
-          </m:sSub>
-        </m:oMath>
-      </m:oMathPara>
-    </w:p>
-    <w:p>
-      <w:pPr>
-        <w:spacing w:before="0" w:after="60"/>
-        <w:jc w:val="right"/>
-      </w:pPr>
+      <m:oMath>
+        <m:f>
+          <m:fPr>
+            <m:type m:val="bar"/>
+          </m:fPr>
+          <m:num>
+            <m:r>
+              <m:t>d</m:t>
+            </m:r>
+            <m:sSub>
+              <m:e>
+                <m:r>
+                  <m:t>I</m:t>
+                </m:r>
+              </m:e>
+              <m:sub>
+                <m:r>
+                  <m:t>i</m:t>
+                </m:r>
+              </m:sub>
+            </m:sSub>
+          </m:num>
+          <m:den>
+            <m:r>
+              <m:t>d</m:t>
+            </m:r>
+            <m:r>
+              <m:t>t</m:t>
+            </m:r>
+          </m:den>
+        </m:f>
+        <m:r>
+          <m:rPr>
+            <m:sty m:val="p"/>
+          </m:rPr>
+          <m:t>=</m:t>
+        </m:r>
+        <m:sSub>
+          <m:e>
+            <m:r>
+              <m:t>β</m:t>
+            </m:r>
+          </m:e>
+          <m:sub>
+            <m:r>
+              <m:t>i</m:t>
+            </m:r>
+          </m:sub>
+        </m:sSub>
+        <m:d>
+          <m:dPr>
+            <m:begChr m:val="("/>
+            <m:endChr m:val=")"/>
+            <m:sepChr m:val=""/>
+            <m:grow/>
+          </m:dPr>
+          <m:e>
+            <m:r>
+              <m:t>t</m:t>
+            </m:r>
+          </m:e>
+        </m:d>
+        <m:d>
+          <m:dPr>
+            <m:begChr m:val="("/>
+            <m:endChr m:val=")"/>
+            <m:sepChr m:val=""/>
+            <m:grow/>
+          </m:dPr>
+          <m:e>
+            <m:r>
+              <m:t>1</m:t>
+            </m:r>
+            <m:r>
+              <m:rPr>
+                <m:sty m:val="p"/>
+              </m:rPr>
+              <m:t>−</m:t>
+            </m:r>
+            <m:f>
+              <m:fPr>
+                <m:type m:val="bar"/>
+              </m:fPr>
+              <m:num>
+                <m:sSub>
+                  <m:e>
+                    <m:r>
+                      <m:t>I</m:t>
+                    </m:r>
+                  </m:e>
+                  <m:sub>
+                    <m:r>
+                      <m:t>i</m:t>
+                    </m:r>
+                  </m:sub>
+                </m:sSub>
+              </m:num>
+              <m:den>
+                <m:sSub>
+                  <m:e>
+                    <m:r>
+                      <m:t>N</m:t>
+                    </m:r>
+                  </m:e>
+                  <m:sub>
+                    <m:r>
+                      <m:t>i</m:t>
+                    </m:r>
+                  </m:sub>
+                </m:sSub>
+              </m:den>
+            </m:f>
+          </m:e>
+        </m:d>
+        <m:nary>
+          <m:naryPr>
+            <m:chr m:val="∑"/>
+            <m:limLoc m:val="undOvr"/>
+            <m:subHide m:val="off"/>
+            <m:supHide m:val="on"/>
+          </m:naryPr>
+          <m:sub>
+            <m:r>
+              <m:t>j</m:t>
+            </m:r>
+          </m:sub>
+          <m:sup>
+            <m:r>
+              <m:t>​</m:t>
+            </m:r>
+          </m:sup>
+          <m:e>
+            <m:sSub>
+              <m:e>
+                <m:r>
+                  <m:t>C</m:t>
+                </m:r>
+              </m:e>
+              <m:sub>
+                <m:r>
+                  <m:t>i</m:t>
+                </m:r>
+                <m:r>
+                  <m:t>j</m:t>
+                </m:r>
+              </m:sub>
+            </m:sSub>
+          </m:e>
+        </m:nary>
+        <m:d>
+          <m:dPr>
+            <m:begChr m:val="("/>
+            <m:endChr m:val=")"/>
+            <m:sepChr m:val=""/>
+            <m:grow/>
+          </m:dPr>
+          <m:e>
+            <m:r>
+              <m:t>t</m:t>
+            </m:r>
+          </m:e>
+        </m:d>
+        <m:sSub>
+          <m:e>
+            <m:r>
+              <m:t>I</m:t>
+            </m:r>
+          </m:e>
+          <m:sub>
+            <m:r>
+              <m:t>j</m:t>
+            </m:r>
+          </m:sub>
+        </m:sSub>
+        <m:r>
+          <m:rPr>
+            <m:sty m:val="p"/>
+          </m:rPr>
+          <m:t>−</m:t>
+        </m:r>
+        <m:sSub>
+          <m:e>
+            <m:r>
+              <m:t>γ</m:t>
+            </m:r>
+          </m:e>
+          <m:sub>
+            <m:r>
+              <m:t>i</m:t>
+            </m:r>
+          </m:sub>
+        </m:sSub>
+        <m:d>
+          <m:dPr>
+            <m:begChr m:val="("/>
+            <m:endChr m:val=")"/>
+            <m:sepChr m:val=""/>
+            <m:grow/>
+          </m:dPr>
+          <m:e>
+            <m:r>
+              <m:t>t</m:t>
+            </m:r>
+          </m:e>
+        </m:d>
+        <m:sSub>
+          <m:e>
+            <m:r>
+              <m:t>I</m:t>
+            </m:r>
+          </m:e>
+          <m:sub>
+            <m:r>
+              <m:t>i</m:t>
+            </m:r>
+          </m:sub>
+        </m:sSub>
+      </m:oMath>
       <w:r>
         <w:rPr>
-          <w:sz w:val="14"/>
+          <w:sz w:val="16"/>
         </w:rPr>
-        <w:t>(1)</w:t>
+        <w:t xml:space="preserve">   (1)</w:t>
       </w:r>
     </w:p>
     <w:p>
       <w:pPr>
-        <w:pStyle w:val="FirstParagraph"/>
+        <w:spacing w:before="80" w:after="120"/>
+        <w:jc w:val="center"/>
       </w:pPr>
-      <m:oMathPara>
-        <m:oMathParaPr>
-          <m:jc m:val="center"/>
-        </m:oMathParaPr>
-        <m:oMath>
-          <m:r>
-            <m:t>C</m:t>
-          </m:r>
-          <m:d>
-            <m:dPr>
-              <m:begChr m:val="("/>
-              <m:endChr m:val=")"/>
-              <m:sepChr m:val=""/>
-              <m:grow/>
-            </m:dPr>
-            <m:e>
-              <m:r>
-                <m:t>t</m:t>
-              </m:r>
-            </m:e>
-          </m:d>
-          <m:r>
-            <m:rPr>
-              <m:sty m:val="p"/>
-            </m:rPr>
-            <m:t>=</m:t>
-          </m:r>
-          <m:r>
-            <m:rPr>
-              <m:sty m:val="p"/>
-            </m:rPr>
-            <m:t>I</m:t>
-          </m:r>
-          <m:r>
-            <m:rPr>
-              <m:sty m:val="p"/>
-            </m:rPr>
-            <m:t>d</m:t>
-          </m:r>
-          <m:r>
-            <m:rPr>
-              <m:sty m:val="p"/>
-            </m:rPr>
-            <m:t>+</m:t>
-          </m:r>
-          <m:r>
-            <m:t>κ</m:t>
-          </m:r>
-          <m:sSub>
-            <m:e>
-              <m:r>
-                <m:t>τ</m:t>
-              </m:r>
-            </m:e>
-            <m:sub>
-              <m:r>
-                <m:t>0</m:t>
-              </m:r>
-            </m:sub>
-          </m:sSub>
-          <m:r>
-            <m:t>M</m:t>
-          </m:r>
-          <m:d>
-            <m:dPr>
-              <m:begChr m:val="("/>
-              <m:endChr m:val=")"/>
-              <m:sepChr m:val=""/>
-              <m:grow/>
-            </m:dPr>
-            <m:e>
-              <m:r>
-                <m:t>t</m:t>
-              </m:r>
-            </m:e>
-          </m:d>
-          <m:r>
-            <m:rPr>
-              <m:sty m:val="p"/>
-            </m:rPr>
-            <m:t>,</m:t>
-          </m:r>
-          <m:r>
-            <m:t>  </m:t>
-          </m:r>
-          <m:sSub>
-            <m:e>
-              <m:r>
-                <m:t>S</m:t>
-              </m:r>
-            </m:e>
-            <m:sub>
-              <m:r>
-                <m:t>i</m:t>
-              </m:r>
-            </m:sub>
-          </m:sSub>
-          <m:r>
-            <m:rPr>
-              <m:sty m:val="p"/>
-            </m:rPr>
-            <m:t>=</m:t>
-          </m:r>
-          <m:sSub>
-            <m:e>
-              <m:r>
-                <m:t>N</m:t>
-              </m:r>
-            </m:e>
-            <m:sub>
-              <m:r>
-                <m:t>i</m:t>
-              </m:r>
-            </m:sub>
-          </m:sSub>
-          <m:r>
-            <m:rPr>
-              <m:sty m:val="p"/>
-            </m:rPr>
-            <m:t>−</m:t>
-          </m:r>
-          <m:sSub>
-            <m:e>
-              <m:r>
-                <m:t>I</m:t>
-              </m:r>
-            </m:e>
-            <m:sub>
-              <m:r>
-                <m:t>i</m:t>
-              </m:r>
-            </m:sub>
-          </m:sSub>
-          <m:r>
-            <m:rPr>
-              <m:sty m:val="p"/>
-            </m:rPr>
-            <m:t>,</m:t>
-          </m:r>
-          <m:r>
-            <m:t> </m:t>
-          </m:r>
-          <m:sSub>
-            <m:e>
-              <m:r>
-                <m:t>x</m:t>
-              </m:r>
-            </m:e>
-            <m:sub>
-              <m:r>
-                <m:t>i</m:t>
-              </m:r>
-            </m:sub>
-          </m:sSub>
-          <m:r>
-            <m:rPr>
-              <m:sty m:val="p"/>
-            </m:rPr>
-            <m:t>=</m:t>
-          </m:r>
-          <m:sSub>
-            <m:e>
-              <m:r>
-                <m:t>I</m:t>
-              </m:r>
-            </m:e>
-            <m:sub>
-              <m:r>
-                <m:t>i</m:t>
-              </m:r>
-            </m:sub>
-          </m:sSub>
-          <m:r>
-            <m:rPr>
-              <m:sty m:val="p"/>
-            </m:rPr>
-            <m:t>/</m:t>
-          </m:r>
-          <m:sSub>
-            <m:e>
-              <m:r>
-                <m:t>N</m:t>
-              </m:r>
-            </m:e>
-            <m:sub>
-              <m:r>
-                <m:t>i</m:t>
-              </m:r>
-            </m:sub>
-          </m:sSub>
-        </m:oMath>
-      </m:oMathPara>
-    </w:p>
-    <w:p>
-      <w:pPr>
-        <w:spacing w:before="0" w:after="60"/>
-        <w:jc w:val="right"/>
-      </w:pPr>
+      <m:oMath>
+        <m:r>
+          <m:t>C</m:t>
+        </m:r>
+        <m:d>
+          <m:dPr>
+            <m:begChr m:val="("/>
+            <m:endChr m:val=")"/>
+            <m:sepChr m:val=""/>
+            <m:grow/>
+          </m:dPr>
+          <m:e>
+            <m:r>
+              <m:t>t</m:t>
+            </m:r>
+          </m:e>
+        </m:d>
+        <m:r>
+          <m:rPr>
+            <m:sty m:val="p"/>
+          </m:rPr>
+          <m:t>=</m:t>
+        </m:r>
+        <m:r>
+          <m:rPr>
+            <m:sty m:val="p"/>
+          </m:rPr>
+          <m:t>I</m:t>
+        </m:r>
+        <m:r>
+          <m:rPr>
+            <m:sty m:val="p"/>
+          </m:rPr>
+          <m:t>d</m:t>
+        </m:r>
+        <m:r>
+          <m:rPr>
+            <m:sty m:val="p"/>
+          </m:rPr>
+          <m:t>+</m:t>
+        </m:r>
+        <m:r>
+          <m:t>κ</m:t>
+        </m:r>
+        <m:sSub>
+          <m:e>
+            <m:r>
+              <m:t>τ</m:t>
+            </m:r>
+          </m:e>
+          <m:sub>
+            <m:r>
+              <m:t>0</m:t>
+            </m:r>
+          </m:sub>
+        </m:sSub>
+        <m:r>
+          <m:t>M</m:t>
+        </m:r>
+        <m:d>
+          <m:dPr>
+            <m:begChr m:val="("/>
+            <m:endChr m:val=")"/>
+            <m:sepChr m:val=""/>
+            <m:grow/>
+          </m:dPr>
+          <m:e>
+            <m:r>
+              <m:t>t</m:t>
+            </m:r>
+          </m:e>
+        </m:d>
+        <m:r>
+          <m:rPr>
+            <m:sty m:val="p"/>
+          </m:rPr>
+          <m:t>,</m:t>
+        </m:r>
+        <m:r>
+          <m:t>  </m:t>
+        </m:r>
+        <m:sSub>
+          <m:e>
+            <m:r>
+              <m:t>S</m:t>
+            </m:r>
+          </m:e>
+          <m:sub>
+            <m:r>
+              <m:t>i</m:t>
+            </m:r>
+          </m:sub>
+        </m:sSub>
+        <m:r>
+          <m:rPr>
+            <m:sty m:val="p"/>
+          </m:rPr>
+          <m:t>=</m:t>
+        </m:r>
+        <m:sSub>
+          <m:e>
+            <m:r>
+              <m:t>N</m:t>
+            </m:r>
+          </m:e>
+          <m:sub>
+            <m:r>
+              <m:t>i</m:t>
+            </m:r>
+          </m:sub>
+        </m:sSub>
+        <m:r>
+          <m:rPr>
+            <m:sty m:val="p"/>
+          </m:rPr>
+          <m:t>−</m:t>
+        </m:r>
+        <m:sSub>
+          <m:e>
+            <m:r>
+              <m:t>I</m:t>
+            </m:r>
+          </m:e>
+          <m:sub>
+            <m:r>
+              <m:t>i</m:t>
+            </m:r>
+          </m:sub>
+        </m:sSub>
+        <m:r>
+          <m:rPr>
+            <m:sty m:val="p"/>
+          </m:rPr>
+          <m:t>,</m:t>
+        </m:r>
+        <m:r>
+          <m:t> </m:t>
+        </m:r>
+        <m:sSub>
+          <m:e>
+            <m:r>
+              <m:t>x</m:t>
+            </m:r>
+          </m:e>
+          <m:sub>
+            <m:r>
+              <m:t>i</m:t>
+            </m:r>
+          </m:sub>
+        </m:sSub>
+        <m:r>
+          <m:rPr>
+            <m:sty m:val="p"/>
+          </m:rPr>
+          <m:t>=</m:t>
+        </m:r>
+        <m:sSub>
+          <m:e>
+            <m:r>
+              <m:t>I</m:t>
+            </m:r>
+          </m:e>
+          <m:sub>
+            <m:r>
+              <m:t>i</m:t>
+            </m:r>
+          </m:sub>
+        </m:sSub>
+        <m:r>
+          <m:rPr>
+            <m:sty m:val="p"/>
+          </m:rPr>
+          <m:t>/</m:t>
+        </m:r>
+        <m:sSub>
+          <m:e>
+            <m:r>
+              <m:t>N</m:t>
+            </m:r>
+          </m:e>
+          <m:sub>
+            <m:r>
+              <m:t>i</m:t>
+            </m:r>
+          </m:sub>
+        </m:sSub>
+      </m:oMath>
       <w:r>
         <w:rPr>
-          <w:sz w:val="14"/>
+          <w:sz w:val="16"/>
         </w:rPr>
-        <w:t>(2)</w:t>
+        <w:t xml:space="preserve">   (2)</w:t>
       </w:r>
     </w:p>
     <w:p>
       <w:pPr>
-        <w:pStyle w:val="FirstParagraph"/>
+        <w:spacing w:before="80" w:after="120"/>
+        <w:jc w:val="center"/>
       </w:pPr>
-      <m:oMathPara>
-        <m:oMathParaPr>
-          <m:jc m:val="center"/>
-        </m:oMathParaPr>
-        <m:oMath>
-          <m:sSub>
-            <m:e>
-              <m:r>
-                <m:t>R</m:t>
-              </m:r>
-            </m:e>
-            <m:sub>
-              <m:r>
-                <m:t>d</m:t>
-              </m:r>
-            </m:sub>
-          </m:sSub>
-          <m:d>
-            <m:dPr>
-              <m:begChr m:val="("/>
-              <m:endChr m:val=")"/>
-              <m:sepChr m:val=""/>
-              <m:grow/>
-            </m:dPr>
-            <m:e>
-              <m:r>
-                <m:t>t</m:t>
-              </m:r>
-            </m:e>
-          </m:d>
-          <m:r>
-            <m:rPr>
-              <m:sty m:val="p"/>
-            </m:rPr>
-            <m:t>=</m:t>
-          </m:r>
-          <m:r>
-            <m:t>ρ</m:t>
-          </m:r>
-          <m:d>
-            <m:dPr>
-              <m:begChr m:val="("/>
-              <m:endChr m:val=")"/>
-              <m:sepChr m:val=""/>
-              <m:grow/>
-            </m:dPr>
-            <m:e>
-              <m:r>
-                <m:t>K</m:t>
-              </m:r>
-              <m:d>
-                <m:dPr>
-                  <m:begChr m:val="("/>
-                  <m:endChr m:val=")"/>
-                  <m:sepChr m:val=""/>
-                  <m:grow/>
-                </m:dPr>
-                <m:e>
-                  <m:r>
-                    <m:t>t</m:t>
-                  </m:r>
-                </m:e>
-              </m:d>
-            </m:e>
-          </m:d>
-          <m:r>
-            <m:rPr>
-              <m:sty m:val="p"/>
-            </m:rPr>
-            <m:t>,</m:t>
-          </m:r>
-          <m:r>
-            <m:t>  </m:t>
-          </m:r>
-          <m:r>
-            <m:t>K</m:t>
-          </m:r>
-          <m:d>
-            <m:dPr>
-              <m:begChr m:val="("/>
-              <m:endChr m:val=")"/>
-              <m:sepChr m:val=""/>
-              <m:grow/>
-            </m:dPr>
-            <m:e>
-              <m:r>
-                <m:t>t</m:t>
-              </m:r>
-            </m:e>
-          </m:d>
-          <m:r>
-            <m:rPr>
-              <m:sty m:val="p"/>
-            </m:rPr>
-            <m:t>=</m:t>
-          </m:r>
-          <m:r>
-            <m:rPr>
-              <m:sty m:val="p"/>
-            </m:rPr>
-            <m:t>diag</m:t>
-          </m:r>
-          <m:d>
-            <m:dPr>
-              <m:begChr m:val="("/>
-              <m:endChr m:val=")"/>
-              <m:sepChr m:val=""/>
-              <m:grow/>
-            </m:dPr>
-            <m:e>
-              <m:sSub>
-                <m:e>
-                  <m:r>
-                    <m:t>β</m:t>
-                  </m:r>
-                </m:e>
-                <m:sub>
-                  <m:r>
-                    <m:t>i</m:t>
-                  </m:r>
-                </m:sub>
-              </m:sSub>
-              <m:d>
-                <m:dPr>
-                  <m:begChr m:val="("/>
-                  <m:endChr m:val=")"/>
-                  <m:sepChr m:val=""/>
-                  <m:grow/>
-                </m:dPr>
-                <m:e>
-                  <m:r>
-                    <m:t>t</m:t>
-                  </m:r>
-                </m:e>
-              </m:d>
-              <m:d>
-                <m:dPr>
-                  <m:begChr m:val="("/>
-                  <m:endChr m:val=")"/>
-                  <m:sepChr m:val=""/>
-                  <m:grow/>
-                </m:dPr>
-                <m:e>
-                  <m:r>
-                    <m:t>1</m:t>
-                  </m:r>
-                  <m:r>
-                    <m:rPr>
-                      <m:sty m:val="p"/>
-                    </m:rPr>
-                    <m:t>−</m:t>
-                  </m:r>
-                  <m:sSub>
-                    <m:e>
-                      <m:r>
-                        <m:t>x</m:t>
-                      </m:r>
-                    </m:e>
-                    <m:sub>
-                      <m:r>
-                        <m:t>i</m:t>
-                      </m:r>
-                    </m:sub>
-                  </m:sSub>
-                  <m:d>
-                    <m:dPr>
-                      <m:begChr m:val="("/>
-                      <m:endChr m:val=")"/>
-                      <m:sepChr m:val=""/>
-                      <m:grow/>
-                    </m:dPr>
-                    <m:e>
-                      <m:r>
-                        <m:t>t</m:t>
-                      </m:r>
-                    </m:e>
-                  </m:d>
-                </m:e>
-              </m:d>
-            </m:e>
-          </m:d>
-          <m:r>
-            <m:t>C</m:t>
-          </m:r>
-          <m:d>
-            <m:dPr>
-              <m:begChr m:val="("/>
-              <m:endChr m:val=")"/>
-              <m:sepChr m:val=""/>
-              <m:grow/>
-            </m:dPr>
-            <m:e>
-              <m:r>
-                <m:t>t</m:t>
-              </m:r>
-            </m:e>
-          </m:d>
-          <m:r>
-            <m:t>Γ</m:t>
-          </m:r>
-          <m:sSup>
-            <m:e>
-              <m:d>
-                <m:dPr>
-                  <m:begChr m:val="("/>
-                  <m:endChr m:val=")"/>
-                  <m:sepChr m:val=""/>
-                  <m:grow/>
-                </m:dPr>
-                <m:e>
-                  <m:r>
-                    <m:t>t</m:t>
-                  </m:r>
-                </m:e>
-              </m:d>
-            </m:e>
-            <m:sup>
-              <m:r>
-                <m:rPr>
-                  <m:sty m:val="p"/>
-                </m:rPr>
-                <m:t>−</m:t>
-              </m:r>
-              <m:r>
-                <m:t>1</m:t>
-              </m:r>
-            </m:sup>
-          </m:sSup>
-        </m:oMath>
-      </m:oMathPara>
-    </w:p>
-    <w:p>
-      <w:pPr>
-        <w:spacing w:before="0" w:after="60"/>
-        <w:jc w:val="right"/>
-      </w:pPr>
+      <m:oMath>
+        <m:sSub>
+          <m:e>
+            <m:r>
+              <m:t>R</m:t>
+            </m:r>
+          </m:e>
+          <m:sub>
+            <m:r>
+              <m:t>d</m:t>
+            </m:r>
+          </m:sub>
+        </m:sSub>
+        <m:d>
+          <m:dPr>
+            <m:begChr m:val="("/>
+            <m:endChr m:val=")"/>
+            <m:sepChr m:val=""/>
+            <m:grow/>
+          </m:dPr>
+          <m:e>
+            <m:r>
+              <m:t>t</m:t>
+            </m:r>
+          </m:e>
+        </m:d>
+        <m:r>
+          <m:rPr>
+            <m:sty m:val="p"/>
+          </m:rPr>
+          <m:t>=</m:t>
+        </m:r>
+        <m:r>
+          <m:t>ρ</m:t>
+        </m:r>
+        <m:r>
+          <m:t>​</m:t>
+        </m:r>
+        <m:d>
+          <m:dPr>
+            <m:begChr m:val="["/>
+            <m:endChr m:val="]"/>
+            <m:sepChr m:val=""/>
+            <m:grow/>
+          </m:dPr>
+          <m:e>
+            <m:r>
+              <m:rPr>
+                <m:sty m:val="p"/>
+              </m:rPr>
+              <m:t>diag</m:t>
+            </m:r>
+            <m:r>
+              <m:t>​</m:t>
+            </m:r>
+            <m:d>
+              <m:dPr>
+                <m:begChr m:val="("/>
+                <m:endChr m:val=")"/>
+                <m:sepChr m:val=""/>
+                <m:grow/>
+              </m:dPr>
+              <m:e>
+                <m:sSub>
+                  <m:e>
+                    <m:r>
+                      <m:t>β</m:t>
+                    </m:r>
+                  </m:e>
+                  <m:sub>
+                    <m:r>
+                      <m:t>i</m:t>
+                    </m:r>
+                  </m:sub>
+                </m:sSub>
+                <m:d>
+                  <m:dPr>
+                    <m:begChr m:val="("/>
+                    <m:endChr m:val=")"/>
+                    <m:sepChr m:val=""/>
+                    <m:grow/>
+                  </m:dPr>
+                  <m:e>
+                    <m:r>
+                      <m:t>t</m:t>
+                    </m:r>
+                  </m:e>
+                </m:d>
+                <m:d>
+                  <m:dPr>
+                    <m:begChr m:val="("/>
+                    <m:endChr m:val=")"/>
+                    <m:sepChr m:val=""/>
+                    <m:grow/>
+                  </m:dPr>
+                  <m:e>
+                    <m:r>
+                      <m:t>1</m:t>
+                    </m:r>
+                    <m:r>
+                      <m:rPr>
+                        <m:sty m:val="p"/>
+                      </m:rPr>
+                      <m:t>−</m:t>
+                    </m:r>
+                    <m:sSub>
+                      <m:e>
+                        <m:r>
+                          <m:t>x</m:t>
+                        </m:r>
+                      </m:e>
+                      <m:sub>
+                        <m:r>
+                          <m:t>i</m:t>
+                        </m:r>
+                      </m:sub>
+                    </m:sSub>
+                    <m:d>
+                      <m:dPr>
+                        <m:begChr m:val="("/>
+                        <m:endChr m:val=")"/>
+                        <m:sepChr m:val=""/>
+                        <m:grow/>
+                      </m:dPr>
+                      <m:e>
+                        <m:r>
+                          <m:t>t</m:t>
+                        </m:r>
+                      </m:e>
+                    </m:d>
+                  </m:e>
+                </m:d>
+              </m:e>
+            </m:d>
+            <m:r>
+              <m:t>C</m:t>
+            </m:r>
+            <m:d>
+              <m:dPr>
+                <m:begChr m:val="("/>
+                <m:endChr m:val=")"/>
+                <m:sepChr m:val=""/>
+                <m:grow/>
+              </m:dPr>
+              <m:e>
+                <m:r>
+                  <m:t>t</m:t>
+                </m:r>
+              </m:e>
+            </m:d>
+            <m:r>
+              <m:t>Γ</m:t>
+            </m:r>
+            <m:sSup>
+              <m:e>
+                <m:d>
+                  <m:dPr>
+                    <m:begChr m:val="("/>
+                    <m:endChr m:val=")"/>
+                    <m:sepChr m:val=""/>
+                    <m:grow/>
+                  </m:dPr>
+                  <m:e>
+                    <m:r>
+                      <m:t>t</m:t>
+                    </m:r>
+                  </m:e>
+                </m:d>
+              </m:e>
+              <m:sup>
+                <m:r>
+                  <m:rPr>
+                    <m:sty m:val="p"/>
+                  </m:rPr>
+                  <m:t>−</m:t>
+                </m:r>
+                <m:r>
+                  <m:t>1</m:t>
+                </m:r>
+              </m:sup>
+            </m:sSup>
+          </m:e>
+        </m:d>
+      </m:oMath>
       <w:r>
         <w:rPr>
-          <w:sz w:val="14"/>
+          <w:sz w:val="16"/>
         </w:rPr>
-        <w:t>(3)</w:t>
+        <w:t xml:space="preserve">   (3)</w:t>
       </w:r>
     </w:p>
     <w:tbl>

</xml_diff>